<commit_message>
update gitignore to ignore documentations folder and add proposal draft document
</commit_message>
<xml_diff>
--- a/Documentations/A0357457N SwarajGupta Proposal Draft 1.docx
+++ b/Documentations/A0357457N SwarajGupta Proposal Draft 1.docx
@@ -119,7 +119,7 @@
               <w:spacing w:before="60" w:after="60"/>
             </w:pPr>
             <w:r>
-              <w:t>217</w:t>
+              <w:t>26</w:t>
             </w:r>
           </w:p>
         </w:tc>
@@ -157,10 +157,7 @@
               </w:rPr>
             </w:pPr>
             <w:r>
-              <w:t>Gupta Swaraj</w:t>
-            </w:r>
-            <w:r>
-              <w:t xml:space="preserve">, </w:t>
+              <w:t xml:space="preserve">Gupta Swaraj, </w:t>
             </w:r>
             <w:r>
               <w:rPr>
@@ -201,7 +198,16 @@
               <w:spacing w:before="60" w:after="60"/>
             </w:pPr>
             <w:r>
-              <w:t>13/09/2026</w:t>
+              <w:t>25</w:t>
+            </w:r>
+            <w:r>
+              <w:t>/</w:t>
+            </w:r>
+            <w:r>
+              <w:t>10</w:t>
+            </w:r>
+            <w:r>
+              <w:t>/2026</w:t>
             </w:r>
           </w:p>
         </w:tc>
@@ -812,7 +818,6 @@
         <w:spacing w:after="40"/>
       </w:pPr>
       <w:r>
-        <w:lastRenderedPageBreak/>
         <w:t>No black-box predictive price forecasting — focus is exclusively on cause-and-effect reasoning and portfolio resilience education.</w:t>
       </w:r>
     </w:p>
@@ -822,6 +827,7 @@
         <w:spacing w:after="40"/>
       </w:pPr>
       <w:r>
+        <w:lastRenderedPageBreak/>
         <w:t>Privacy-preserving architecture: fully offline local LLM inference with zero external API dependencies.</w:t>
       </w:r>
     </w:p>
@@ -1524,7 +1530,6 @@
         <w:pStyle w:val="Heading2"/>
       </w:pPr>
       <w:r>
-        <w:lastRenderedPageBreak/>
         <w:t>5.2 Deterministic Pricing Engine</w:t>
       </w:r>
     </w:p>
@@ -1552,6 +1557,7 @@
           <w:i/>
           <w:color w:val="1A3A5F"/>
         </w:rPr>
+        <w:lastRenderedPageBreak/>
         <w:t>ΔP = β × SectorImpact × CapMultiplier × (1 + DebtPenalty – CashBuffer) + Noise</w:t>
       </w:r>
     </w:p>
@@ -2438,7 +2444,6 @@
         <w:pStyle w:val="Heading2"/>
       </w:pPr>
       <w:r>
-        <w:lastRenderedPageBreak/>
         <w:t>5.5 Benchmarking &amp; Performance Evaluation</w:t>
       </w:r>
     </w:p>
@@ -2650,6 +2655,7 @@
               <w:rPr>
                 <w:sz w:val="19"/>
               </w:rPr>
+              <w:lastRenderedPageBreak/>
               <w:t>Dalio All-Weather</w:t>
             </w:r>
             <w:r>
@@ -3618,12 +3624,6 @@
                 <w:sz w:val="19"/>
               </w:rPr>
               <w:br/>
-            </w:r>
-            <w:r>
-              <w:rPr>
-                <w:sz w:val="19"/>
-              </w:rPr>
-              <w:lastRenderedPageBreak/>
               <w:t>Campaign mode with narrative story arcs.</w:t>
             </w:r>
           </w:p>
@@ -3635,7 +3635,6 @@
         <w:pStyle w:val="Heading1"/>
       </w:pPr>
       <w:r>
-        <w:lastRenderedPageBreak/>
         <w:t>8. Future Work &amp; Conclusion</w:t>
       </w:r>
     </w:p>
@@ -3686,6 +3685,7 @@
         <w:rPr>
           <w:b/>
         </w:rPr>
+        <w:lastRenderedPageBreak/>
         <w:t xml:space="preserve">Campaign Mode: </w:t>
       </w:r>
       <w:r>
@@ -3871,7 +3871,6 @@
         <w:rPr>
           <w:sz w:val="19"/>
         </w:rPr>
-        <w:lastRenderedPageBreak/>
         <w:t>[10] NUS-ISS Intelligent Reasoning Systems (IRS) Course Materials.</w:t>
       </w:r>
     </w:p>
@@ -4699,6 +4698,7 @@
   <w:style w:type="character" w:default="1" w:styleId="DefaultParagraphFont">
     <w:name w:val="Default Paragraph Font"/>
     <w:uiPriority w:val="1"/>
+    <w:semiHidden/>
     <w:unhideWhenUsed/>
   </w:style>
   <w:style w:type="table" w:default="1" w:styleId="TableNormal">

</xml_diff>

<commit_message>
docs: add project proposal draft and remove repository readme
</commit_message>
<xml_diff>
--- a/Documentations/A0357457N SwarajGupta Proposal Draft 1.docx
+++ b/Documentations/A0357457N SwarajGupta Proposal Draft 1.docx
@@ -119,7 +119,10 @@
               <w:spacing w:before="60" w:after="60"/>
             </w:pPr>
             <w:r>
-              <w:t>217</w:t>
+              <w:t>2</w:t>
+            </w:r>
+            <w:r>
+              <w:t>6</w:t>
             </w:r>
           </w:p>
         </w:tc>
@@ -157,10 +160,7 @@
               </w:rPr>
             </w:pPr>
             <w:r>
-              <w:t>Gupta Swaraj</w:t>
-            </w:r>
-            <w:r>
-              <w:t xml:space="preserve">, </w:t>
+              <w:t xml:space="preserve">Gupta Swaraj, </w:t>
             </w:r>
             <w:r>
               <w:rPr>
@@ -201,7 +201,16 @@
               <w:spacing w:before="60" w:after="60"/>
             </w:pPr>
             <w:r>
-              <w:t>13/09/2026</w:t>
+              <w:t>25</w:t>
+            </w:r>
+            <w:r>
+              <w:t>/</w:t>
+            </w:r>
+            <w:r>
+              <w:t>10</w:t>
+            </w:r>
+            <w:r>
+              <w:t>/2026</w:t>
             </w:r>
           </w:p>
         </w:tc>
@@ -812,7 +821,6 @@
         <w:spacing w:after="40"/>
       </w:pPr>
       <w:r>
-        <w:lastRenderedPageBreak/>
         <w:t>No black-box predictive price forecasting — focus is exclusively on cause-and-effect reasoning and portfolio resilience education.</w:t>
       </w:r>
     </w:p>
@@ -822,6 +830,7 @@
         <w:spacing w:after="40"/>
       </w:pPr>
       <w:r>
+        <w:lastRenderedPageBreak/>
         <w:t>Privacy-preserving architecture: fully offline local LLM inference with zero external API dependencies.</w:t>
       </w:r>
     </w:p>
@@ -1524,7 +1533,6 @@
         <w:pStyle w:val="Heading2"/>
       </w:pPr>
       <w:r>
-        <w:lastRenderedPageBreak/>
         <w:t>5.2 Deterministic Pricing Engine</w:t>
       </w:r>
     </w:p>
@@ -1552,6 +1560,7 @@
           <w:i/>
           <w:color w:val="1A3A5F"/>
         </w:rPr>
+        <w:lastRenderedPageBreak/>
         <w:t>ΔP = β × SectorImpact × CapMultiplier × (1 + DebtPenalty – CashBuffer) + Noise</w:t>
       </w:r>
     </w:p>
@@ -2438,7 +2447,6 @@
         <w:pStyle w:val="Heading2"/>
       </w:pPr>
       <w:r>
-        <w:lastRenderedPageBreak/>
         <w:t>5.5 Benchmarking &amp; Performance Evaluation</w:t>
       </w:r>
     </w:p>
@@ -2650,6 +2658,7 @@
               <w:rPr>
                 <w:sz w:val="19"/>
               </w:rPr>
+              <w:lastRenderedPageBreak/>
               <w:t>Dalio All-Weather</w:t>
             </w:r>
             <w:r>
@@ -3618,12 +3627,6 @@
                 <w:sz w:val="19"/>
               </w:rPr>
               <w:br/>
-            </w:r>
-            <w:r>
-              <w:rPr>
-                <w:sz w:val="19"/>
-              </w:rPr>
-              <w:lastRenderedPageBreak/>
               <w:t>Campaign mode with narrative story arcs.</w:t>
             </w:r>
           </w:p>
@@ -3635,7 +3638,6 @@
         <w:pStyle w:val="Heading1"/>
       </w:pPr>
       <w:r>
-        <w:lastRenderedPageBreak/>
         <w:t>8. Future Work &amp; Conclusion</w:t>
       </w:r>
     </w:p>
@@ -3686,6 +3688,7 @@
         <w:rPr>
           <w:b/>
         </w:rPr>
+        <w:lastRenderedPageBreak/>
         <w:t xml:space="preserve">Campaign Mode: </w:t>
       </w:r>
       <w:r>
@@ -3871,7 +3874,6 @@
         <w:rPr>
           <w:sz w:val="19"/>
         </w:rPr>
-        <w:lastRenderedPageBreak/>
         <w:t>[10] NUS-ISS Intelligent Reasoning Systems (IRS) Course Materials.</w:t>
       </w:r>
     </w:p>
@@ -4699,6 +4701,7 @@
   <w:style w:type="character" w:default="1" w:styleId="DefaultParagraphFont">
     <w:name w:val="Default Paragraph Font"/>
     <w:uiPriority w:val="1"/>
+    <w:semiHidden/>
     <w:unhideWhenUsed/>
   </w:style>
   <w:style w:type="table" w:default="1" w:styleId="TableNormal">

</xml_diff>